<commit_message>
Update Contract + Onboarding
</commit_message>
<xml_diff>
--- a/Gamebar Contract.docx
+++ b/Gamebar Contract.docx
@@ -1,6 +1,6 @@
 
 <file path=word/document.xml><?xml version="1.0" encoding="utf-8"?>
-<w:document xmlns:wpc="http://schemas.microsoft.com/office/word/2010/wordprocessingCanvas" xmlns:cx="http://schemas.microsoft.com/office/drawing/2014/chartex" xmlns:cx1="http://schemas.microsoft.com/office/drawing/2015/9/8/chartex" xmlns:cx2="http://schemas.microsoft.com/office/drawing/2015/10/21/chartex" xmlns:cx3="http://schemas.microsoft.com/office/drawing/2016/5/9/chartex" xmlns:cx4="http://schemas.microsoft.com/office/drawing/2016/5/10/chartex" xmlns:cx5="http://schemas.microsoft.com/office/drawing/2016/5/11/chartex" xmlns:cx6="http://schemas.microsoft.com/office/drawing/2016/5/12/chartex" xmlns:cx7="http://schemas.microsoft.com/office/drawing/2016/5/13/chartex" xmlns:cx8="http://schemas.microsoft.com/office/drawing/2016/5/14/chartex" xmlns:mc="http://schemas.openxmlformats.org/markup-compatibility/2006" xmlns:aink="http://schemas.microsoft.com/office/drawing/2016/ink" xmlns:am3d="http://schemas.microsoft.com/office/drawing/2017/model3d" xmlns:o="urn:schemas-microsoft-com:office:office" xmlns:oel="http://schemas.microsoft.com/office/2019/extlst" xmlns:r="http://schemas.openxmlformats.org/officeDocument/2006/relationships" xmlns:m="http://schemas.openxmlformats.org/officeDocument/2006/math" xmlns:v="urn:schemas-microsoft-com:vml" xmlns:wp14="http://schemas.microsoft.com/office/word/2010/wordprocessingDrawing" xmlns:wp="http://schemas.openxmlformats.org/drawingml/2006/wordprocessingDrawing" xmlns:w10="urn:schemas-microsoft-com:office:word" xmlns:w="http://schemas.openxmlformats.org/wordprocessingml/2006/main" xmlns:w14="http://schemas.microsoft.com/office/word/2010/wordml" xmlns:w15="http://schemas.microsoft.com/office/word/2012/wordml" xmlns:w16cei="http://schemas.microsoft.com/office/word/2026/wordml/cei" xmlns:w16cex="http://schemas.microsoft.com/office/word/2018/wordml/cex" xmlns:w16cid="http://schemas.microsoft.com/office/word/2016/wordml/cid" xmlns:w16="http://schemas.microsoft.com/office/word/2018/wordml" xmlns:w16du="http://schemas.microsoft.com/office/word/2023/wordml/word16du" xmlns:w16sdtdh="http://schemas.microsoft.com/office/word/2020/wordml/sdtdatahash" xmlns:w16sdtfl="http://schemas.microsoft.com/office/word/2024/wordml/sdtformatlock" xmlns:w16se="http://schemas.microsoft.com/office/word/2015/wordml/symex" xmlns:wpg="http://schemas.microsoft.com/office/word/2010/wordprocessingGroup" xmlns:wpi="http://schemas.microsoft.com/office/word/2010/wordprocessingInk" xmlns:wne="http://schemas.microsoft.com/office/word/2006/wordml" xmlns:wps="http://schemas.microsoft.com/office/word/2010/wordprocessingShape" mc:Ignorable="w14 w15 w16se w16cid w16 w16cex w16sdtdh w16sdtfl w16du wp14">
+<w:document xmlns:wpc="http://schemas.microsoft.com/office/word/2010/wordprocessingCanvas" xmlns:cx="http://schemas.microsoft.com/office/drawing/2014/chartex" xmlns:cx1="http://schemas.microsoft.com/office/drawing/2015/9/8/chartex" xmlns:cx2="http://schemas.microsoft.com/office/drawing/2015/10/21/chartex" xmlns:cx3="http://schemas.microsoft.com/office/drawing/2016/5/9/chartex" xmlns:cx4="http://schemas.microsoft.com/office/drawing/2016/5/10/chartex" xmlns:cx5="http://schemas.microsoft.com/office/drawing/2016/5/11/chartex" xmlns:cx6="http://schemas.microsoft.com/office/drawing/2016/5/12/chartex" xmlns:cx7="http://schemas.microsoft.com/office/drawing/2016/5/13/chartex" xmlns:cx8="http://schemas.microsoft.com/office/drawing/2016/5/14/chartex" xmlns:mc="http://schemas.openxmlformats.org/markup-compatibility/2006" xmlns:aink="http://schemas.microsoft.com/office/drawing/2016/ink" xmlns:am3d="http://schemas.microsoft.com/office/drawing/2017/model3d" xmlns:o="urn:schemas-microsoft-com:office:office" xmlns:oel="http://schemas.microsoft.com/office/2019/extlst" xmlns:r="http://schemas.openxmlformats.org/officeDocument/2006/relationships" xmlns:m="http://schemas.openxmlformats.org/officeDocument/2006/math" xmlns:v="urn:schemas-microsoft-com:vml" xmlns:wp14="http://schemas.microsoft.com/office/word/2010/wordprocessingDrawing" xmlns:wp="http://schemas.openxmlformats.org/drawingml/2006/wordprocessingDrawing" xmlns:w10="urn:schemas-microsoft-com:office:word" xmlns:w="http://schemas.openxmlformats.org/wordprocessingml/2006/main" xmlns:w14="http://schemas.microsoft.com/office/word/2010/wordml" xmlns:w15="http://schemas.microsoft.com/office/word/2012/wordml" xmlns:w16cex="http://schemas.microsoft.com/office/word/2018/wordml/cex" xmlns:w16cid="http://schemas.microsoft.com/office/word/2016/wordml/cid" xmlns:w16="http://schemas.microsoft.com/office/word/2018/wordml" xmlns:w16du="http://schemas.microsoft.com/office/word/2023/wordml/word16du" xmlns:w16sdtdh="http://schemas.microsoft.com/office/word/2020/wordml/sdtdatahash" xmlns:w16sdtfl="http://schemas.microsoft.com/office/word/2024/wordml/sdtformatlock" xmlns:w16se="http://schemas.microsoft.com/office/word/2015/wordml/symex" xmlns:wpg="http://schemas.microsoft.com/office/word/2010/wordprocessingGroup" xmlns:wpi="http://schemas.microsoft.com/office/word/2010/wordprocessingInk" xmlns:wne="http://schemas.microsoft.com/office/word/2006/wordml" xmlns:wps="http://schemas.microsoft.com/office/word/2010/wordprocessingShape" mc:Ignorable="w14 w15 w16se w16cid w16 w16cex w16sdtdh w16sdtfl w16du wp14">
   <w:body>
     <w:p>
       <w:pPr>
@@ -244,7 +244,21 @@
           <w:sz w:val="26"/>
           <w:szCs w:val="26"/>
         </w:rPr>
-        <w:t xml:space="preserve">Games will generally be simple timewasters, based on pre-existing games, however unique games will be created from time to time. Games may be </w:t>
+        <w:t>Games will generally be simple timewasters, based on pre-existing games, however unique</w:t>
+      </w:r>
+      <w:r>
+        <w:rPr>
+          <w:sz w:val="26"/>
+          <w:szCs w:val="26"/>
+        </w:rPr>
+        <w:t xml:space="preserve"> or bigger</w:t>
+      </w:r>
+      <w:r>
+        <w:rPr>
+          <w:sz w:val="26"/>
+          <w:szCs w:val="26"/>
+        </w:rPr>
+        <w:t xml:space="preserve"> games will be created from time to time. Games may be </w:t>
       </w:r>
       <w:proofErr w:type="gramStart"/>
       <w:r>
@@ -399,7 +413,23 @@
           <w:sz w:val="26"/>
           <w:szCs w:val="26"/>
         </w:rPr>
-        <w:t>issue has a checklist containing all current and future plans for</w:t>
+        <w:t xml:space="preserve">issue has a checklist containing all current and </w:t>
+      </w:r>
+      <w:proofErr w:type="gramStart"/>
+      <w:r>
+        <w:rPr>
+          <w:sz w:val="26"/>
+          <w:szCs w:val="26"/>
+        </w:rPr>
+        <w:t>future plans</w:t>
+      </w:r>
+      <w:proofErr w:type="gramEnd"/>
+      <w:r>
+        <w:rPr>
+          <w:sz w:val="26"/>
+          <w:szCs w:val="26"/>
+        </w:rPr>
+        <w:t xml:space="preserve"> for</w:t>
       </w:r>
       <w:r>
         <w:rPr>
@@ -413,7 +443,21 @@
           <w:sz w:val="26"/>
           <w:szCs w:val="26"/>
         </w:rPr>
-        <w:t>implementation, while starred items are what is required for release. Games may take several weeks to complete, so don’t stress about issues not being done within a week.</w:t>
+        <w:t>implementation, while starred items are what is required for release</w:t>
+      </w:r>
+      <w:r>
+        <w:rPr>
+          <w:sz w:val="26"/>
+          <w:szCs w:val="26"/>
+        </w:rPr>
+        <w:t>, though some issues will not have this at all</w:t>
+      </w:r>
+      <w:r>
+        <w:rPr>
+          <w:sz w:val="26"/>
+          <w:szCs w:val="26"/>
+        </w:rPr>
+        <w:t>. Games may take several weeks to complete, so don’t stress about issues not being done within a week.</w:t>
       </w:r>
       <w:r>
         <w:rPr>
@@ -493,7 +537,15 @@
           <w:sz w:val="26"/>
           <w:szCs w:val="26"/>
         </w:rPr>
-        <w:t xml:space="preserve">Once games are completed, any further development will typically fall on the original developer, as they know their own coding best. Most problems revolving around </w:t>
+        <w:t xml:space="preserve">Once games are completed, any further development will typically fall on the original developer, as they know their own coding best. Most problems revolving </w:t>
+      </w:r>
+      <w:r>
+        <w:rPr>
+          <w:sz w:val="26"/>
+          <w:szCs w:val="26"/>
+        </w:rPr>
+        <w:lastRenderedPageBreak/>
+        <w:t xml:space="preserve">around </w:t>
       </w:r>
       <w:proofErr w:type="spellStart"/>
       <w:r>
@@ -509,15 +561,7 @@
           <w:sz w:val="26"/>
           <w:szCs w:val="26"/>
         </w:rPr>
-        <w:t xml:space="preserve"> integration / the home page will fall on the Project Manager </w:t>
-      </w:r>
-      <w:r>
-        <w:rPr>
-          <w:sz w:val="26"/>
-          <w:szCs w:val="26"/>
-        </w:rPr>
-        <w:lastRenderedPageBreak/>
-        <w:t xml:space="preserve">(Chris). Once integration is completed, a </w:t>
+        <w:t xml:space="preserve"> integration / the home page will fall on the Project Manager (Chris). Once integration is completed, a </w:t>
       </w:r>
       <w:proofErr w:type="gramStart"/>
       <w:r>
@@ -663,7 +707,15 @@
           <w:sz w:val="26"/>
           <w:szCs w:val="26"/>
         </w:rPr>
-        <w:t xml:space="preserve">→ Payment will not be given if there is no weekly income flow from </w:t>
+        <w:t xml:space="preserve">→ </w:t>
+      </w:r>
+      <w:r>
+        <w:rPr>
+          <w:rFonts w:ascii="Arial Unicode MS" w:eastAsia="Arial Unicode MS" w:hAnsi="Arial Unicode MS" w:cs="Arial Unicode MS"/>
+          <w:sz w:val="26"/>
+          <w:szCs w:val="26"/>
+        </w:rPr>
+        <w:t xml:space="preserve">500 </w:t>
       </w:r>
       <w:proofErr w:type="spellStart"/>
       <w:r>
@@ -672,9 +724,35 @@
           <w:sz w:val="26"/>
           <w:szCs w:val="26"/>
         </w:rPr>
-        <w:t>Gamebar</w:t>
+        <w:t>digipogs</w:t>
       </w:r>
       <w:proofErr w:type="spellEnd"/>
+      <w:r>
+        <w:rPr>
+          <w:rFonts w:ascii="Arial Unicode MS" w:eastAsia="Arial Unicode MS" w:hAnsi="Arial Unicode MS" w:cs="Arial Unicode MS"/>
+          <w:sz w:val="26"/>
+          <w:szCs w:val="26"/>
+        </w:rPr>
+        <w:t xml:space="preserve"> + </w:t>
+      </w:r>
+      <w:proofErr w:type="spellStart"/>
+      <w:r>
+        <w:rPr>
+          <w:rFonts w:ascii="Arial Unicode MS" w:eastAsia="Arial Unicode MS" w:hAnsi="Arial Unicode MS" w:cs="Arial Unicode MS"/>
+          <w:sz w:val="26"/>
+          <w:szCs w:val="26"/>
+        </w:rPr>
+        <w:t>Gamebar’s</w:t>
+      </w:r>
+      <w:proofErr w:type="spellEnd"/>
+      <w:r>
+        <w:rPr>
+          <w:rFonts w:ascii="Arial Unicode MS" w:eastAsia="Arial Unicode MS" w:hAnsi="Arial Unicode MS" w:cs="Arial Unicode MS"/>
+          <w:sz w:val="26"/>
+          <w:szCs w:val="26"/>
+        </w:rPr>
+        <w:t xml:space="preserve"> weekly income will be distributed post-SCRUM.</w:t>
+      </w:r>
     </w:p>
     <w:p>
       <w:pPr>
@@ -1846,7 +1924,7 @@
 </file>
 
 <file path=word/endnotes.xml><?xml version="1.0" encoding="utf-8"?>
-<w:endnotes xmlns:wpc="http://schemas.microsoft.com/office/word/2010/wordprocessingCanvas" xmlns:cx="http://schemas.microsoft.com/office/drawing/2014/chartex" xmlns:cx1="http://schemas.microsoft.com/office/drawing/2015/9/8/chartex" xmlns:cx2="http://schemas.microsoft.com/office/drawing/2015/10/21/chartex" xmlns:cx3="http://schemas.microsoft.com/office/drawing/2016/5/9/chartex" xmlns:cx4="http://schemas.microsoft.com/office/drawing/2016/5/10/chartex" xmlns:cx5="http://schemas.microsoft.com/office/drawing/2016/5/11/chartex" xmlns:cx6="http://schemas.microsoft.com/office/drawing/2016/5/12/chartex" xmlns:cx7="http://schemas.microsoft.com/office/drawing/2016/5/13/chartex" xmlns:cx8="http://schemas.microsoft.com/office/drawing/2016/5/14/chartex" xmlns:mc="http://schemas.openxmlformats.org/markup-compatibility/2006" xmlns:aink="http://schemas.microsoft.com/office/drawing/2016/ink" xmlns:am3d="http://schemas.microsoft.com/office/drawing/2017/model3d" xmlns:o="urn:schemas-microsoft-com:office:office" xmlns:oel="http://schemas.microsoft.com/office/2019/extlst" xmlns:r="http://schemas.openxmlformats.org/officeDocument/2006/relationships" xmlns:m="http://schemas.openxmlformats.org/officeDocument/2006/math" xmlns:v="urn:schemas-microsoft-com:vml" xmlns:wp14="http://schemas.microsoft.com/office/word/2010/wordprocessingDrawing" xmlns:wp="http://schemas.openxmlformats.org/drawingml/2006/wordprocessingDrawing" xmlns:w10="urn:schemas-microsoft-com:office:word" xmlns:w="http://schemas.openxmlformats.org/wordprocessingml/2006/main" xmlns:w14="http://schemas.microsoft.com/office/word/2010/wordml" xmlns:w15="http://schemas.microsoft.com/office/word/2012/wordml" xmlns:w16cei="http://schemas.microsoft.com/office/word/2026/wordml/cei" xmlns:w16cex="http://schemas.microsoft.com/office/word/2018/wordml/cex" xmlns:w16cid="http://schemas.microsoft.com/office/word/2016/wordml/cid" xmlns:w16="http://schemas.microsoft.com/office/word/2018/wordml" xmlns:w16du="http://schemas.microsoft.com/office/word/2023/wordml/word16du" xmlns:w16sdtdh="http://schemas.microsoft.com/office/word/2020/wordml/sdtdatahash" xmlns:w16sdtfl="http://schemas.microsoft.com/office/word/2024/wordml/sdtformatlock" xmlns:w16se="http://schemas.microsoft.com/office/word/2015/wordml/symex" xmlns:wpg="http://schemas.microsoft.com/office/word/2010/wordprocessingGroup" xmlns:wpi="http://schemas.microsoft.com/office/word/2010/wordprocessingInk" xmlns:wne="http://schemas.microsoft.com/office/word/2006/wordml" xmlns:wps="http://schemas.microsoft.com/office/word/2010/wordprocessingShape" mc:Ignorable="w14 w15 w16se w16cid w16 w16cex w16sdtdh w16sdtfl w16du wp14">
+<w:endnotes xmlns:wpc="http://schemas.microsoft.com/office/word/2010/wordprocessingCanvas" xmlns:cx="http://schemas.microsoft.com/office/drawing/2014/chartex" xmlns:cx1="http://schemas.microsoft.com/office/drawing/2015/9/8/chartex" xmlns:cx2="http://schemas.microsoft.com/office/drawing/2015/10/21/chartex" xmlns:cx3="http://schemas.microsoft.com/office/drawing/2016/5/9/chartex" xmlns:cx4="http://schemas.microsoft.com/office/drawing/2016/5/10/chartex" xmlns:cx5="http://schemas.microsoft.com/office/drawing/2016/5/11/chartex" xmlns:cx6="http://schemas.microsoft.com/office/drawing/2016/5/12/chartex" xmlns:cx7="http://schemas.microsoft.com/office/drawing/2016/5/13/chartex" xmlns:cx8="http://schemas.microsoft.com/office/drawing/2016/5/14/chartex" xmlns:mc="http://schemas.openxmlformats.org/markup-compatibility/2006" xmlns:aink="http://schemas.microsoft.com/office/drawing/2016/ink" xmlns:am3d="http://schemas.microsoft.com/office/drawing/2017/model3d" xmlns:o="urn:schemas-microsoft-com:office:office" xmlns:oel="http://schemas.microsoft.com/office/2019/extlst" xmlns:r="http://schemas.openxmlformats.org/officeDocument/2006/relationships" xmlns:m="http://schemas.openxmlformats.org/officeDocument/2006/math" xmlns:v="urn:schemas-microsoft-com:vml" xmlns:wp14="http://schemas.microsoft.com/office/word/2010/wordprocessingDrawing" xmlns:wp="http://schemas.openxmlformats.org/drawingml/2006/wordprocessingDrawing" xmlns:w10="urn:schemas-microsoft-com:office:word" xmlns:w="http://schemas.openxmlformats.org/wordprocessingml/2006/main" xmlns:w14="http://schemas.microsoft.com/office/word/2010/wordml" xmlns:w15="http://schemas.microsoft.com/office/word/2012/wordml" xmlns:w16cex="http://schemas.microsoft.com/office/word/2018/wordml/cex" xmlns:w16cid="http://schemas.microsoft.com/office/word/2016/wordml/cid" xmlns:w16="http://schemas.microsoft.com/office/word/2018/wordml" xmlns:w16du="http://schemas.microsoft.com/office/word/2023/wordml/word16du" xmlns:w16sdtdh="http://schemas.microsoft.com/office/word/2020/wordml/sdtdatahash" xmlns:w16sdtfl="http://schemas.microsoft.com/office/word/2024/wordml/sdtformatlock" xmlns:w16se="http://schemas.microsoft.com/office/word/2015/wordml/symex" xmlns:wpg="http://schemas.microsoft.com/office/word/2010/wordprocessingGroup" xmlns:wpi="http://schemas.microsoft.com/office/word/2010/wordprocessingInk" xmlns:wne="http://schemas.microsoft.com/office/word/2006/wordml" xmlns:wps="http://schemas.microsoft.com/office/word/2010/wordprocessingShape" mc:Ignorable="w14 w15 w16se w16cid w16 w16cex w16sdtdh w16sdtfl w16du wp14">
   <w:endnote w:type="separator" w:id="-1">
     <w:p>
       <w:pPr>
@@ -1871,7 +1949,7 @@
 </file>
 
 <file path=word/footer1.xml><?xml version="1.0" encoding="utf-8"?>
-<w:ftr xmlns:wpc="http://schemas.microsoft.com/office/word/2010/wordprocessingCanvas" xmlns:cx="http://schemas.microsoft.com/office/drawing/2014/chartex" xmlns:cx1="http://schemas.microsoft.com/office/drawing/2015/9/8/chartex" xmlns:cx2="http://schemas.microsoft.com/office/drawing/2015/10/21/chartex" xmlns:cx3="http://schemas.microsoft.com/office/drawing/2016/5/9/chartex" xmlns:cx4="http://schemas.microsoft.com/office/drawing/2016/5/10/chartex" xmlns:cx5="http://schemas.microsoft.com/office/drawing/2016/5/11/chartex" xmlns:cx6="http://schemas.microsoft.com/office/drawing/2016/5/12/chartex" xmlns:cx7="http://schemas.microsoft.com/office/drawing/2016/5/13/chartex" xmlns:cx8="http://schemas.microsoft.com/office/drawing/2016/5/14/chartex" xmlns:mc="http://schemas.openxmlformats.org/markup-compatibility/2006" xmlns:aink="http://schemas.microsoft.com/office/drawing/2016/ink" xmlns:am3d="http://schemas.microsoft.com/office/drawing/2017/model3d" xmlns:o="urn:schemas-microsoft-com:office:office" xmlns:oel="http://schemas.microsoft.com/office/2019/extlst" xmlns:r="http://schemas.openxmlformats.org/officeDocument/2006/relationships" xmlns:m="http://schemas.openxmlformats.org/officeDocument/2006/math" xmlns:v="urn:schemas-microsoft-com:vml" xmlns:wp14="http://schemas.microsoft.com/office/word/2010/wordprocessingDrawing" xmlns:wp="http://schemas.openxmlformats.org/drawingml/2006/wordprocessingDrawing" xmlns:w10="urn:schemas-microsoft-com:office:word" xmlns:w="http://schemas.openxmlformats.org/wordprocessingml/2006/main" xmlns:w14="http://schemas.microsoft.com/office/word/2010/wordml" xmlns:w15="http://schemas.microsoft.com/office/word/2012/wordml" xmlns:w16cei="http://schemas.microsoft.com/office/word/2026/wordml/cei" xmlns:w16cex="http://schemas.microsoft.com/office/word/2018/wordml/cex" xmlns:w16cid="http://schemas.microsoft.com/office/word/2016/wordml/cid" xmlns:w16="http://schemas.microsoft.com/office/word/2018/wordml" xmlns:w16du="http://schemas.microsoft.com/office/word/2023/wordml/word16du" xmlns:w16sdtdh="http://schemas.microsoft.com/office/word/2020/wordml/sdtdatahash" xmlns:w16sdtfl="http://schemas.microsoft.com/office/word/2024/wordml/sdtformatlock" xmlns:w16se="http://schemas.microsoft.com/office/word/2015/wordml/symex" xmlns:wpg="http://schemas.microsoft.com/office/word/2010/wordprocessingGroup" xmlns:wpi="http://schemas.microsoft.com/office/word/2010/wordprocessingInk" xmlns:wne="http://schemas.microsoft.com/office/word/2006/wordml" xmlns:wps="http://schemas.microsoft.com/office/word/2010/wordprocessingShape" mc:Ignorable="w14 w15 w16se w16cid w16 w16cex w16sdtdh w16sdtfl w16du wp14">
+<w:ftr xmlns:wpc="http://schemas.microsoft.com/office/word/2010/wordprocessingCanvas" xmlns:cx="http://schemas.microsoft.com/office/drawing/2014/chartex" xmlns:cx1="http://schemas.microsoft.com/office/drawing/2015/9/8/chartex" xmlns:cx2="http://schemas.microsoft.com/office/drawing/2015/10/21/chartex" xmlns:cx3="http://schemas.microsoft.com/office/drawing/2016/5/9/chartex" xmlns:cx4="http://schemas.microsoft.com/office/drawing/2016/5/10/chartex" xmlns:cx5="http://schemas.microsoft.com/office/drawing/2016/5/11/chartex" xmlns:cx6="http://schemas.microsoft.com/office/drawing/2016/5/12/chartex" xmlns:cx7="http://schemas.microsoft.com/office/drawing/2016/5/13/chartex" xmlns:cx8="http://schemas.microsoft.com/office/drawing/2016/5/14/chartex" xmlns:mc="http://schemas.openxmlformats.org/markup-compatibility/2006" xmlns:aink="http://schemas.microsoft.com/office/drawing/2016/ink" xmlns:am3d="http://schemas.microsoft.com/office/drawing/2017/model3d" xmlns:o="urn:schemas-microsoft-com:office:office" xmlns:oel="http://schemas.microsoft.com/office/2019/extlst" xmlns:r="http://schemas.openxmlformats.org/officeDocument/2006/relationships" xmlns:m="http://schemas.openxmlformats.org/officeDocument/2006/math" xmlns:v="urn:schemas-microsoft-com:vml" xmlns:wp14="http://schemas.microsoft.com/office/word/2010/wordprocessingDrawing" xmlns:wp="http://schemas.openxmlformats.org/drawingml/2006/wordprocessingDrawing" xmlns:w10="urn:schemas-microsoft-com:office:word" xmlns:w="http://schemas.openxmlformats.org/wordprocessingml/2006/main" xmlns:w14="http://schemas.microsoft.com/office/word/2010/wordml" xmlns:w15="http://schemas.microsoft.com/office/word/2012/wordml" xmlns:w16cex="http://schemas.microsoft.com/office/word/2018/wordml/cex" xmlns:w16cid="http://schemas.microsoft.com/office/word/2016/wordml/cid" xmlns:w16="http://schemas.microsoft.com/office/word/2018/wordml" xmlns:w16du="http://schemas.microsoft.com/office/word/2023/wordml/word16du" xmlns:w16sdtdh="http://schemas.microsoft.com/office/word/2020/wordml/sdtdatahash" xmlns:w16sdtfl="http://schemas.microsoft.com/office/word/2024/wordml/sdtformatlock" xmlns:w16se="http://schemas.microsoft.com/office/word/2015/wordml/symex" xmlns:wpg="http://schemas.microsoft.com/office/word/2010/wordprocessingGroup" xmlns:wpi="http://schemas.microsoft.com/office/word/2010/wordprocessingInk" xmlns:wne="http://schemas.microsoft.com/office/word/2006/wordml" xmlns:wps="http://schemas.microsoft.com/office/word/2010/wordprocessingShape" mc:Ignorable="w14 w15 w16se w16cid w16 w16cex w16sdtdh w16sdtfl w16du wp14">
   <w:p>
     <w:pPr>
       <w:rPr>
@@ -1898,13 +1976,13 @@
 </file>
 
 <file path=word/footer2.xml><?xml version="1.0" encoding="utf-8"?>
-<w:ftr xmlns:wpc="http://schemas.microsoft.com/office/word/2010/wordprocessingCanvas" xmlns:cx="http://schemas.microsoft.com/office/drawing/2014/chartex" xmlns:cx1="http://schemas.microsoft.com/office/drawing/2015/9/8/chartex" xmlns:cx2="http://schemas.microsoft.com/office/drawing/2015/10/21/chartex" xmlns:cx3="http://schemas.microsoft.com/office/drawing/2016/5/9/chartex" xmlns:cx4="http://schemas.microsoft.com/office/drawing/2016/5/10/chartex" xmlns:cx5="http://schemas.microsoft.com/office/drawing/2016/5/11/chartex" xmlns:cx6="http://schemas.microsoft.com/office/drawing/2016/5/12/chartex" xmlns:cx7="http://schemas.microsoft.com/office/drawing/2016/5/13/chartex" xmlns:cx8="http://schemas.microsoft.com/office/drawing/2016/5/14/chartex" xmlns:mc="http://schemas.openxmlformats.org/markup-compatibility/2006" xmlns:aink="http://schemas.microsoft.com/office/drawing/2016/ink" xmlns:am3d="http://schemas.microsoft.com/office/drawing/2017/model3d" xmlns:o="urn:schemas-microsoft-com:office:office" xmlns:oel="http://schemas.microsoft.com/office/2019/extlst" xmlns:r="http://schemas.openxmlformats.org/officeDocument/2006/relationships" xmlns:m="http://schemas.openxmlformats.org/officeDocument/2006/math" xmlns:v="urn:schemas-microsoft-com:vml" xmlns:wp14="http://schemas.microsoft.com/office/word/2010/wordprocessingDrawing" xmlns:wp="http://schemas.openxmlformats.org/drawingml/2006/wordprocessingDrawing" xmlns:w10="urn:schemas-microsoft-com:office:word" xmlns:w="http://schemas.openxmlformats.org/wordprocessingml/2006/main" xmlns:w14="http://schemas.microsoft.com/office/word/2010/wordml" xmlns:w15="http://schemas.microsoft.com/office/word/2012/wordml" xmlns:w16cei="http://schemas.microsoft.com/office/word/2026/wordml/cei" xmlns:w16cex="http://schemas.microsoft.com/office/word/2018/wordml/cex" xmlns:w16cid="http://schemas.microsoft.com/office/word/2016/wordml/cid" xmlns:w16="http://schemas.microsoft.com/office/word/2018/wordml" xmlns:w16du="http://schemas.microsoft.com/office/word/2023/wordml/word16du" xmlns:w16sdtdh="http://schemas.microsoft.com/office/word/2020/wordml/sdtdatahash" xmlns:w16sdtfl="http://schemas.microsoft.com/office/word/2024/wordml/sdtformatlock" xmlns:w16se="http://schemas.microsoft.com/office/word/2015/wordml/symex" xmlns:wpg="http://schemas.microsoft.com/office/word/2010/wordprocessingGroup" xmlns:wpi="http://schemas.microsoft.com/office/word/2010/wordprocessingInk" xmlns:wne="http://schemas.microsoft.com/office/word/2006/wordml" xmlns:wps="http://schemas.microsoft.com/office/word/2010/wordprocessingShape" mc:Ignorable="w14 w15 w16se w16cid w16 w16cex w16sdtdh w16sdtfl w16du wp14">
+<w:ftr xmlns:wpc="http://schemas.microsoft.com/office/word/2010/wordprocessingCanvas" xmlns:cx="http://schemas.microsoft.com/office/drawing/2014/chartex" xmlns:cx1="http://schemas.microsoft.com/office/drawing/2015/9/8/chartex" xmlns:cx2="http://schemas.microsoft.com/office/drawing/2015/10/21/chartex" xmlns:cx3="http://schemas.microsoft.com/office/drawing/2016/5/9/chartex" xmlns:cx4="http://schemas.microsoft.com/office/drawing/2016/5/10/chartex" xmlns:cx5="http://schemas.microsoft.com/office/drawing/2016/5/11/chartex" xmlns:cx6="http://schemas.microsoft.com/office/drawing/2016/5/12/chartex" xmlns:cx7="http://schemas.microsoft.com/office/drawing/2016/5/13/chartex" xmlns:cx8="http://schemas.microsoft.com/office/drawing/2016/5/14/chartex" xmlns:mc="http://schemas.openxmlformats.org/markup-compatibility/2006" xmlns:aink="http://schemas.microsoft.com/office/drawing/2016/ink" xmlns:am3d="http://schemas.microsoft.com/office/drawing/2017/model3d" xmlns:o="urn:schemas-microsoft-com:office:office" xmlns:oel="http://schemas.microsoft.com/office/2019/extlst" xmlns:r="http://schemas.openxmlformats.org/officeDocument/2006/relationships" xmlns:m="http://schemas.openxmlformats.org/officeDocument/2006/math" xmlns:v="urn:schemas-microsoft-com:vml" xmlns:wp14="http://schemas.microsoft.com/office/word/2010/wordprocessingDrawing" xmlns:wp="http://schemas.openxmlformats.org/drawingml/2006/wordprocessingDrawing" xmlns:w10="urn:schemas-microsoft-com:office:word" xmlns:w="http://schemas.openxmlformats.org/wordprocessingml/2006/main" xmlns:w14="http://schemas.microsoft.com/office/word/2010/wordml" xmlns:w15="http://schemas.microsoft.com/office/word/2012/wordml" xmlns:w16cex="http://schemas.microsoft.com/office/word/2018/wordml/cex" xmlns:w16cid="http://schemas.microsoft.com/office/word/2016/wordml/cid" xmlns:w16="http://schemas.microsoft.com/office/word/2018/wordml" xmlns:w16du="http://schemas.microsoft.com/office/word/2023/wordml/word16du" xmlns:w16sdtdh="http://schemas.microsoft.com/office/word/2020/wordml/sdtdatahash" xmlns:w16sdtfl="http://schemas.microsoft.com/office/word/2024/wordml/sdtformatlock" xmlns:w16se="http://schemas.microsoft.com/office/word/2015/wordml/symex" xmlns:wpg="http://schemas.microsoft.com/office/word/2010/wordprocessingGroup" xmlns:wpi="http://schemas.microsoft.com/office/word/2010/wordprocessingInk" xmlns:wne="http://schemas.microsoft.com/office/word/2006/wordml" xmlns:wps="http://schemas.microsoft.com/office/word/2010/wordprocessingShape" mc:Ignorable="w14 w15 w16se w16cid w16 w16cex w16sdtdh w16sdtfl w16du wp14">
   <w:p/>
 </w:ftr>
 </file>
 
 <file path=word/footnotes.xml><?xml version="1.0" encoding="utf-8"?>
-<w:footnotes xmlns:wpc="http://schemas.microsoft.com/office/word/2010/wordprocessingCanvas" xmlns:cx="http://schemas.microsoft.com/office/drawing/2014/chartex" xmlns:cx1="http://schemas.microsoft.com/office/drawing/2015/9/8/chartex" xmlns:cx2="http://schemas.microsoft.com/office/drawing/2015/10/21/chartex" xmlns:cx3="http://schemas.microsoft.com/office/drawing/2016/5/9/chartex" xmlns:cx4="http://schemas.microsoft.com/office/drawing/2016/5/10/chartex" xmlns:cx5="http://schemas.microsoft.com/office/drawing/2016/5/11/chartex" xmlns:cx6="http://schemas.microsoft.com/office/drawing/2016/5/12/chartex" xmlns:cx7="http://schemas.microsoft.com/office/drawing/2016/5/13/chartex" xmlns:cx8="http://schemas.microsoft.com/office/drawing/2016/5/14/chartex" xmlns:mc="http://schemas.openxmlformats.org/markup-compatibility/2006" xmlns:aink="http://schemas.microsoft.com/office/drawing/2016/ink" xmlns:am3d="http://schemas.microsoft.com/office/drawing/2017/model3d" xmlns:o="urn:schemas-microsoft-com:office:office" xmlns:oel="http://schemas.microsoft.com/office/2019/extlst" xmlns:r="http://schemas.openxmlformats.org/officeDocument/2006/relationships" xmlns:m="http://schemas.openxmlformats.org/officeDocument/2006/math" xmlns:v="urn:schemas-microsoft-com:vml" xmlns:wp14="http://schemas.microsoft.com/office/word/2010/wordprocessingDrawing" xmlns:wp="http://schemas.openxmlformats.org/drawingml/2006/wordprocessingDrawing" xmlns:w10="urn:schemas-microsoft-com:office:word" xmlns:w="http://schemas.openxmlformats.org/wordprocessingml/2006/main" xmlns:w14="http://schemas.microsoft.com/office/word/2010/wordml" xmlns:w15="http://schemas.microsoft.com/office/word/2012/wordml" xmlns:w16cei="http://schemas.microsoft.com/office/word/2026/wordml/cei" xmlns:w16cex="http://schemas.microsoft.com/office/word/2018/wordml/cex" xmlns:w16cid="http://schemas.microsoft.com/office/word/2016/wordml/cid" xmlns:w16="http://schemas.microsoft.com/office/word/2018/wordml" xmlns:w16du="http://schemas.microsoft.com/office/word/2023/wordml/word16du" xmlns:w16sdtdh="http://schemas.microsoft.com/office/word/2020/wordml/sdtdatahash" xmlns:w16sdtfl="http://schemas.microsoft.com/office/word/2024/wordml/sdtformatlock" xmlns:w16se="http://schemas.microsoft.com/office/word/2015/wordml/symex" xmlns:wpg="http://schemas.microsoft.com/office/word/2010/wordprocessingGroup" xmlns:wpi="http://schemas.microsoft.com/office/word/2010/wordprocessingInk" xmlns:wne="http://schemas.microsoft.com/office/word/2006/wordml" xmlns:wps="http://schemas.microsoft.com/office/word/2010/wordprocessingShape" mc:Ignorable="w14 w15 w16se w16cid w16 w16cex w16sdtdh w16sdtfl w16du wp14">
+<w:footnotes xmlns:wpc="http://schemas.microsoft.com/office/word/2010/wordprocessingCanvas" xmlns:cx="http://schemas.microsoft.com/office/drawing/2014/chartex" xmlns:cx1="http://schemas.microsoft.com/office/drawing/2015/9/8/chartex" xmlns:cx2="http://schemas.microsoft.com/office/drawing/2015/10/21/chartex" xmlns:cx3="http://schemas.microsoft.com/office/drawing/2016/5/9/chartex" xmlns:cx4="http://schemas.microsoft.com/office/drawing/2016/5/10/chartex" xmlns:cx5="http://schemas.microsoft.com/office/drawing/2016/5/11/chartex" xmlns:cx6="http://schemas.microsoft.com/office/drawing/2016/5/12/chartex" xmlns:cx7="http://schemas.microsoft.com/office/drawing/2016/5/13/chartex" xmlns:cx8="http://schemas.microsoft.com/office/drawing/2016/5/14/chartex" xmlns:mc="http://schemas.openxmlformats.org/markup-compatibility/2006" xmlns:aink="http://schemas.microsoft.com/office/drawing/2016/ink" xmlns:am3d="http://schemas.microsoft.com/office/drawing/2017/model3d" xmlns:o="urn:schemas-microsoft-com:office:office" xmlns:oel="http://schemas.microsoft.com/office/2019/extlst" xmlns:r="http://schemas.openxmlformats.org/officeDocument/2006/relationships" xmlns:m="http://schemas.openxmlformats.org/officeDocument/2006/math" xmlns:v="urn:schemas-microsoft-com:vml" xmlns:wp14="http://schemas.microsoft.com/office/word/2010/wordprocessingDrawing" xmlns:wp="http://schemas.openxmlformats.org/drawingml/2006/wordprocessingDrawing" xmlns:w10="urn:schemas-microsoft-com:office:word" xmlns:w="http://schemas.openxmlformats.org/wordprocessingml/2006/main" xmlns:w14="http://schemas.microsoft.com/office/word/2010/wordml" xmlns:w15="http://schemas.microsoft.com/office/word/2012/wordml" xmlns:w16cex="http://schemas.microsoft.com/office/word/2018/wordml/cex" xmlns:w16cid="http://schemas.microsoft.com/office/word/2016/wordml/cid" xmlns:w16="http://schemas.microsoft.com/office/word/2018/wordml" xmlns:w16du="http://schemas.microsoft.com/office/word/2023/wordml/word16du" xmlns:w16sdtdh="http://schemas.microsoft.com/office/word/2020/wordml/sdtdatahash" xmlns:w16sdtfl="http://schemas.microsoft.com/office/word/2024/wordml/sdtformatlock" xmlns:w16se="http://schemas.microsoft.com/office/word/2015/wordml/symex" xmlns:wpg="http://schemas.microsoft.com/office/word/2010/wordprocessingGroup" xmlns:wpi="http://schemas.microsoft.com/office/word/2010/wordprocessingInk" xmlns:wne="http://schemas.microsoft.com/office/word/2006/wordml" xmlns:wps="http://schemas.microsoft.com/office/word/2010/wordprocessingShape" mc:Ignorable="w14 w15 w16se w16cid w16 w16cex w16sdtdh w16sdtfl w16du wp14">
   <w:footnote w:type="separator" w:id="-1">
     <w:p>
       <w:pPr>
@@ -1929,7 +2007,7 @@
 </file>
 
 <file path=word/header1.xml><?xml version="1.0" encoding="utf-8"?>
-<w:hdr xmlns:wpc="http://schemas.microsoft.com/office/word/2010/wordprocessingCanvas" xmlns:cx="http://schemas.microsoft.com/office/drawing/2014/chartex" xmlns:cx1="http://schemas.microsoft.com/office/drawing/2015/9/8/chartex" xmlns:cx2="http://schemas.microsoft.com/office/drawing/2015/10/21/chartex" xmlns:cx3="http://schemas.microsoft.com/office/drawing/2016/5/9/chartex" xmlns:cx4="http://schemas.microsoft.com/office/drawing/2016/5/10/chartex" xmlns:cx5="http://schemas.microsoft.com/office/drawing/2016/5/11/chartex" xmlns:cx6="http://schemas.microsoft.com/office/drawing/2016/5/12/chartex" xmlns:cx7="http://schemas.microsoft.com/office/drawing/2016/5/13/chartex" xmlns:cx8="http://schemas.microsoft.com/office/drawing/2016/5/14/chartex" xmlns:mc="http://schemas.openxmlformats.org/markup-compatibility/2006" xmlns:aink="http://schemas.microsoft.com/office/drawing/2016/ink" xmlns:am3d="http://schemas.microsoft.com/office/drawing/2017/model3d" xmlns:o="urn:schemas-microsoft-com:office:office" xmlns:oel="http://schemas.microsoft.com/office/2019/extlst" xmlns:r="http://schemas.openxmlformats.org/officeDocument/2006/relationships" xmlns:m="http://schemas.openxmlformats.org/officeDocument/2006/math" xmlns:v="urn:schemas-microsoft-com:vml" xmlns:wp14="http://schemas.microsoft.com/office/word/2010/wordprocessingDrawing" xmlns:wp="http://schemas.openxmlformats.org/drawingml/2006/wordprocessingDrawing" xmlns:w10="urn:schemas-microsoft-com:office:word" xmlns:w="http://schemas.openxmlformats.org/wordprocessingml/2006/main" xmlns:w14="http://schemas.microsoft.com/office/word/2010/wordml" xmlns:w15="http://schemas.microsoft.com/office/word/2012/wordml" xmlns:w16cei="http://schemas.microsoft.com/office/word/2026/wordml/cei" xmlns:w16cex="http://schemas.microsoft.com/office/word/2018/wordml/cex" xmlns:w16cid="http://schemas.microsoft.com/office/word/2016/wordml/cid" xmlns:w16="http://schemas.microsoft.com/office/word/2018/wordml" xmlns:w16du="http://schemas.microsoft.com/office/word/2023/wordml/word16du" xmlns:w16sdtdh="http://schemas.microsoft.com/office/word/2020/wordml/sdtdatahash" xmlns:w16sdtfl="http://schemas.microsoft.com/office/word/2024/wordml/sdtformatlock" xmlns:w16se="http://schemas.microsoft.com/office/word/2015/wordml/symex" xmlns:wpg="http://schemas.microsoft.com/office/word/2010/wordprocessingGroup" xmlns:wpi="http://schemas.microsoft.com/office/word/2010/wordprocessingInk" xmlns:wne="http://schemas.microsoft.com/office/word/2006/wordml" xmlns:wps="http://schemas.microsoft.com/office/word/2010/wordprocessingShape" mc:Ignorable="w14 w15 w16se w16cid w16 w16cex w16sdtdh w16sdtfl w16du wp14">
+<w:hdr xmlns:wpc="http://schemas.microsoft.com/office/word/2010/wordprocessingCanvas" xmlns:cx="http://schemas.microsoft.com/office/drawing/2014/chartex" xmlns:cx1="http://schemas.microsoft.com/office/drawing/2015/9/8/chartex" xmlns:cx2="http://schemas.microsoft.com/office/drawing/2015/10/21/chartex" xmlns:cx3="http://schemas.microsoft.com/office/drawing/2016/5/9/chartex" xmlns:cx4="http://schemas.microsoft.com/office/drawing/2016/5/10/chartex" xmlns:cx5="http://schemas.microsoft.com/office/drawing/2016/5/11/chartex" xmlns:cx6="http://schemas.microsoft.com/office/drawing/2016/5/12/chartex" xmlns:cx7="http://schemas.microsoft.com/office/drawing/2016/5/13/chartex" xmlns:cx8="http://schemas.microsoft.com/office/drawing/2016/5/14/chartex" xmlns:mc="http://schemas.openxmlformats.org/markup-compatibility/2006" xmlns:aink="http://schemas.microsoft.com/office/drawing/2016/ink" xmlns:am3d="http://schemas.microsoft.com/office/drawing/2017/model3d" xmlns:o="urn:schemas-microsoft-com:office:office" xmlns:oel="http://schemas.microsoft.com/office/2019/extlst" xmlns:r="http://schemas.openxmlformats.org/officeDocument/2006/relationships" xmlns:m="http://schemas.openxmlformats.org/officeDocument/2006/math" xmlns:v="urn:schemas-microsoft-com:vml" xmlns:wp14="http://schemas.microsoft.com/office/word/2010/wordprocessingDrawing" xmlns:wp="http://schemas.openxmlformats.org/drawingml/2006/wordprocessingDrawing" xmlns:w10="urn:schemas-microsoft-com:office:word" xmlns:w="http://schemas.openxmlformats.org/wordprocessingml/2006/main" xmlns:w14="http://schemas.microsoft.com/office/word/2010/wordml" xmlns:w15="http://schemas.microsoft.com/office/word/2012/wordml" xmlns:w16cex="http://schemas.microsoft.com/office/word/2018/wordml/cex" xmlns:w16cid="http://schemas.microsoft.com/office/word/2016/wordml/cid" xmlns:w16="http://schemas.microsoft.com/office/word/2018/wordml" xmlns:w16du="http://schemas.microsoft.com/office/word/2023/wordml/word16du" xmlns:w16sdtdh="http://schemas.microsoft.com/office/word/2020/wordml/sdtdatahash" xmlns:w16sdtfl="http://schemas.microsoft.com/office/word/2024/wordml/sdtformatlock" xmlns:w16se="http://schemas.microsoft.com/office/word/2015/wordml/symex" xmlns:wpg="http://schemas.microsoft.com/office/word/2010/wordprocessingGroup" xmlns:wpi="http://schemas.microsoft.com/office/word/2010/wordprocessingInk" xmlns:wne="http://schemas.microsoft.com/office/word/2006/wordml" xmlns:wps="http://schemas.microsoft.com/office/word/2010/wordprocessingShape" mc:Ignorable="w14 w15 w16se w16cid w16 w16cex w16sdtdh w16sdtfl w16du wp14">
   <w:p/>
 </w:hdr>
 </file>

</xml_diff>